<commit_message>
Rà soát Chương 2, Chương 3 và bài báo theo dữ liệu gốc
- Chương 2: khai thác Quy chế quản trị tài sản trí tuệ năm 2024 và Kế hoạch
  07/KH-ĐHTĐ (bản quét, đã nhận dạng chữ); sửa nhận định sai về Điều 34 Quyết
  định 213; thay các số liệu không tái lập được (28/25 bài, ba đề tài không có
  bài báo) bằng số liệu từ danh mục gốc; thêm Hình 2.16 so sánh kế hoạch và
  thực hiện 2024 - 2025; cập nhật nhật ký chuẩn hóa.
- Chương 3 và bài báo: sửa ở chế độ theo dõi thay đổi các trích dẫn pháp luật
  (Điều 135 Luật Sở hữu trí tuệ, Điều 27, 28 Luật 125/2025/QH15, Điều 86,
  Quyết định 1624/QĐ-TTg, Chỉ thị 02/CT-TTg), tên đơn vị, số liệu và các
  đoạn viện dẫn khảo sát, kết quả thí điểm không có trong dữ liệu.
- Báo cáo rà soát và script dựng lại trong scripts/.

Co-Authored-By: Claude Opus 5.5 <noreply@anthropic.com>
Claude-Session: https://claude.ai/code/session_01ThGArqDrUUsqC1zG1BQvVL
</commit_message>
<xml_diff>
--- a/Chuong_2_Thuc_trang_chuan_hoa_bieu_do.docx
+++ b/Chuong_2_Thuc_trang_chuan_hoa_bieu_do.docx
@@ -3454,7 +3454,7 @@
           <w:i/>
           <w:szCs w:val="26"/>
         </w:rPr>
-        <w:t>Nguồn: Tổng hợp của nhóm nghiên cứu từ các danh mục thống kê của Phòng Khoa học Công nghệ, Trường Đại học Thành Đô. Danh mục tham luận hội thảo quốc gia không có trường dữ liệu về thời gian nên chưa tách được theo năm. Đề tài cấp cơ sở được xếp theo năm ghi trong mã số đề tài; đề tài cấp quốc gia được xếp theo năm phê duyệt kinh phí; tham luận hội thảo quốc tế được xếp theo ngày tổ chức.</w:t>
+        <w:t>Nguồn: Tổng hợp của nhóm nghiên cứu từ các danh mục thống kê của Phòng Khoa học Công nghệ, Trường Đại học Thành Đô. Danh mục tham luận hội thảo quốc gia không có trường dữ liệu về thời gian nên chưa tách được theo năm. Đề tài cấp cơ sở được xếp theo năm ghi trong mã số đề tài; đề tài cấp quốc gia được xếp theo năm phê duyệt kinh phí; tham luận hội thảo quốc tế được xếp theo ngày tổ chức. Số liệu bài báo, giáo trình và đề tài cấp cơ sở giai đoạn 2021 - 2023 khớp với số liệu tổng kết tại Kế hoạch số 07/KH-ĐHTĐ ngày 01 tháng 7 năm 2024 của Nhà trường.</w:t>
       </w:r>
     </w:p>
     <w:p>
@@ -5181,7 +5181,7 @@
         <w:rPr>
           <w:szCs w:val="26"/>
         </w:rPr>
-        <w:t>Thứ nhất, các danh mục theo dõi chỉ ghi nhận sản phẩm khoa học gồm bài báo, sách, giáo trình, đề tài và tham luận. Không có danh mục nào trong hệ thống thống kê của Phòng Khoa học Công nghệ theo dõi tài sản trí tuệ đã được đăng ký hoặc đã được cấp văn bằng bảo hộ. Danh mục tài sản trí tuệ tồn tại nhưng do một đơn vị khác lập và không kết nối với hệ thống danh mục nêu trên.</w:t>
+        <w:t>Thứ nhất, các danh mục theo dõi chỉ ghi nhận sản phẩm khoa học gồm bài báo, sách, giáo trình, đề tài và tham luận. Không có danh mục nào trong hệ thống thống kê của Phòng Khoa học Công nghệ theo dõi tài sản trí tuệ đã được đăng ký hoặc đã được cấp văn bằng bảo hộ, dù Điều 11 Quy chế quản trị tài sản trí tuệ năm 2024 giao Phòng nhiệm vụ lập hồ sơ thống kê, theo dõi tài sản trí tuệ thuộc sở hữu của Nhà trường. Danh mục tài sản trí tuệ tồn tại nhưng do một đơn vị khác lập và không kết nối với hệ thống danh mục nêu trên.</w:t>
       </w:r>
     </w:p>
     <w:p>
@@ -5194,14 +5194,7 @@
         <w:rPr>
           <w:szCs w:val="26"/>
         </w:rPr>
-        <w:t xml:space="preserve">Thứ hai, mức độ khai báo sản phẩm trong hồ sơ nghiệm thu đề tài thấp. Hồ sơ nghiệm thu khai 28 bài báo, trong khi phép đối chiếu gắn được 107 bài với các đề tài, tức độ phủ khai báo chỉ đạt 26,2%. Ngược lại, phần đã khai có độ tin cậy cao: 25 trên 28 bài được tìm thấy trong danh mục, đạt 89,3%. Như vậy vấn đề không nằm ở khai sai mà ở khai thiếu. Nếu bài báo, là loại sản phẩm dễ nhận diện nhất, còn không được </w:t>
-      </w:r>
-      <w:r>
-        <w:rPr>
-          <w:szCs w:val="26"/>
-        </w:rPr>
-        <w:lastRenderedPageBreak/>
-        <w:t>khai đủ, thì các sản phẩm dạng công thức, quy trình hoặc sản phẩm vật chất càng ít khả năng được ghi nhận đầy đủ.</w:t>
+        <w:t>Thứ hai, mức độ khai báo sản phẩm trong hồ sơ nghiệm thu đề tài thấp. Hồ sơ nghiệm thu của 26 trên 38 đề tài khai tổng cộng 32 công bố, trong khi phép đối chiếu tên chủ nhiệm đề tài với danh sách tác giả gắn được 107 bài báo với các đề tài, tức độ phủ khai báo chỉ khoảng 29,9%. Phần lớn công bố có liên quan đến đề tài vì vậy không được phản ánh trong hồ sơ nghiệm thu. Nếu bài báo, là loại sản phẩm dễ nhận diện nhất, còn không được khai đủ, thì các sản phẩm dạng công thức, quy trình hoặc sản phẩm vật chất càng ít khả năng được ghi nhận đầy đủ.</w:t>
       </w:r>
     </w:p>
     <w:p>
@@ -5351,7 +5344,7 @@
         <w:rPr>
           <w:szCs w:val="26"/>
         </w:rPr>
-        <w:t>Văn bản nền tảng điều chỉnh hoạt động sở hữu trí tuệ trong Nhà trường là Quy chế hoạt động khoa học công nghệ ban hành kèm Quyết định số 213/QĐ-ĐHTĐ năm 2021. Quy chế dành riêng Chương VI cho sở hữu trí tuệ và chuyển giao công nghệ, gồm ba điều. Điều 34 xác định phạm vi tài sản trí tuệ của Nhà trường, liệt kê tương đối đầy đủ từ tên trường, logo, nhãn hiệu đến công trình khoa học, chương trình đào tạo, ngân hàng đề thi, phần mềm, mô hình thực hành, sáng chế và quy trình công nghệ. Điều 35 quy định quy trình đăng ký bảo hộ theo cơ chế một cửa: tác giả nộp đơn tại Phòng Khoa học Công nghệ, Phòng kiểm tra hình thức trong 25 ngày, tác giả bổ sung trong 15 ngày, Hiệu trưởng ký và Phòng nộp đơn cùng lệ phí. Điều 36 quy định hai công thức phân chia lợi ích từ thương mại hóa, tùy theo nguồn hình thành tài sản.</w:t>
+        <w:t>Văn bản đầu tiên điều chỉnh hoạt động sở hữu trí tuệ trong Nhà trường là Quy chế hoạt động khoa học công nghệ ban hành ngày 28 tháng 12 năm 2021 kèm theo văn bản số 213/QĐ-ĐHTĐ, sau đây gọi là Quyết định 213. Quy chế dành riêng Chương VI cho sở hữu trí tuệ và chuyển giao công nghệ, gồm ba điều. Điều 34 xác định phạm vi tài sản trí tuệ của Nhà trường, liệt kê tương đối đầy đủ từ tên trường, logo, nhãn hiệu, bằng độc quyền sáng chế, giải pháp hữu ích, kiểu dáng công nghiệp đến công trình khoa học, chương trình đào tạo, ngân hàng đề thi, bản ghi âm, ghi hình, phần mềm, mô hình thực hành và quy trình công nghệ. Điều 35 quy định quy trình đăng ký bảo hộ theo cơ chế một cửa: tác giả nộp đơn tại Phòng Khoa học Công nghệ, Phòng kiểm tra hình thức trong 25 ngày, tác giả bổ sung trong 15 ngày, Hiệu trưởng ký và Phòng nộp đơn cùng lệ phí. Điều 36 quy định hai công thức phân chia lợi ích từ thương mại hóa, tùy theo nguồn hình thành tài sản.</w:t>
       </w:r>
     </w:p>
     <w:p>
@@ -5362,9 +5355,10 @@
       </w:pPr>
       <w:r>
         <w:rPr>
-          <w:szCs w:val="26"/>
-        </w:rPr>
-        <w:t>Bên cạnh đó, Nhà trường còn có hai văn bản khác chứa quy định về quyền sở hữu và lợi ích đối với tài sản trí tuệ. Quy chế chi tiêu nội bộ ban hành ngày 01 tháng 8 năm 2026 quy định mức kinh phí xét duyệt cho loại đề tài có đăng ký sở hữu trí tuệ, kèm điều kiện trích kinh phí chuyển giao công nghệ về Trường và định mức quy đổi giờ nghiên cứu khoa học cho từng loại văn bằng. Điều lệ Quỹ Học bổng sau tiến sĩ Ngô Xuân Độ, ban hành năm 2025, quy định chế độ sở hữu và chia lợi ích đối với sản phẩm hình thành từ kinh phí của Quỹ.</w:t>
+          <w:b w:val="0"/>
+          <w:szCs w:val="26"/>
+        </w:rPr>
+        <w:t>Năm 2024, Nhà trường ban hành Quy chế quản trị tài sản trí tuệ, văn bản chuyên biệt đầu tiên về lĩnh vực này. Bản quy chế được cung cấp cho đề tài do Phó Hiệu trưởng ký nhưng chưa ghi số và ngày ban hành; theo Điều 17, quy chế có hiệu lực kể từ ngày ký. Quy chế có bốn nội dung chính. Điều 3 xác định phạm vi tài sản rất rộng, bao gồm cả thông tin kỹ thuật có thể được cấp bằng độc quyền sáng chế hoặc giải pháp hữu ích, cơ sở dữ liệu, phần mềm, giáo trình điện tử, bí quyết và tên miền, đồng thời quy định Nhà trường sở hữu tài sản được tạo ra chủ yếu từ nguồn lực của Trường. Điều 10 quy định nguyên tắc công bố và bảo mật, yêu cầu tác giả xin ý kiến Phòng Khoa học Công nghệ trước khi bộc lộ công khai tài sản có thể bảo hộ. Điều 11 giao Phòng Khoa học Công nghệ quản lý, nhận diện, lập hồ sơ theo dõi và xúc tiến thương mại hóa tài sản trí tuệ, giao Bộ phận Pháp chế thực hiện thủ tục xác lập quyền. Điều 13 quy định lợi ích được phân chia theo thỏa thuận; nếu không có thỏa thuận, Hiệu trưởng quyết định tỷ lệ sau khi trừ các chi phí. Quy chế năm 2024 không dẫn chiếu và không thay thế Chương VI Quyết định 213, nên hai văn bản cùng tồn tại.</w:t>
       </w:r>
     </w:p>
     <w:p>
@@ -5377,7 +5371,20 @@
         <w:rPr>
           <w:szCs w:val="26"/>
         </w:rPr>
-        <w:t>Ba văn bản này chứa bốn quy định khác nhau về phân chia lợi ích từ tài sản trí tuệ, như trình bày tại Bảng 2.4.</w:t>
+        <w:t>Bên cạnh hai quy chế trên, Nhà trường còn có hai văn bản khác chứa quy định về quyền sở hữu và lợi ích đối với tài sản trí tuệ. Quy chế chi tiêu nội bộ ban hành ngày 01 tháng 8 năm 2026 quy định mức kinh phí xét duyệt cho loại đề tài có đăng ký sở hữu trí tuệ, kèm điều kiện trích kinh phí chuyển giao công nghệ về Trường và định mức quy đổi giờ nghiên cứu khoa học cho từng loại văn bằng. Điều lệ Quỹ Học bổng sau tiến sĩ Ngô Xuân Độ, ban hành năm 2025, quy định chế độ sở hữu và chia lợi ích đối với sản phẩm hình thành từ kinh phí của Quỹ.</w:t>
+      </w:r>
+    </w:p>
+    <w:p>
+      <w:pPr>
+        <w:rPr>
+          <w:szCs w:val="26"/>
+        </w:rPr>
+      </w:pPr>
+      <w:r>
+        <w:rPr>
+          <w:szCs w:val="26"/>
+        </w:rPr>
+        <w:t>Bốn văn bản này chứa năm quy định khác nhau về phân chia lợi ích từ tài sản trí tuệ, như trình bày tại Bảng 2.4.</w:t>
       </w:r>
     </w:p>
     <w:p>
@@ -5744,6 +5751,108 @@
               <w:rPr>
                 <w:szCs w:val="26"/>
               </w:rPr>
+              <w:t>Quy chế quản trị tài sản trí tuệ, Điều 13</w:t>
+            </w:r>
+          </w:p>
+        </w:tc>
+        <w:tc>
+          <w:tcPr>
+            <w:tcW w:w="680" w:type="dxa"/>
+          </w:tcPr>
+          <w:p>
+            <w:pPr>
+              <w:ind w:firstLine="0"/>
+              <w:jc w:val="center"/>
+              <w:rPr>
+                <w:szCs w:val="26"/>
+              </w:rPr>
+            </w:pPr>
+            <w:r>
+              <w:rPr>
+                <w:szCs w:val="26"/>
+              </w:rPr>
+              <w:t>2024</w:t>
+            </w:r>
+          </w:p>
+        </w:tc>
+        <w:tc>
+          <w:tcPr>
+            <w:tcW w:w="2608" w:type="dxa"/>
+          </w:tcPr>
+          <w:p>
+            <w:pPr>
+              <w:ind w:firstLine="0"/>
+              <w:rPr>
+                <w:szCs w:val="26"/>
+              </w:rPr>
+            </w:pPr>
+            <w:r>
+              <w:rPr>
+                <w:szCs w:val="26"/>
+              </w:rPr>
+              <w:t>Tài sản trí tuệ của Trường khi các bên không có thỏa thuận</w:t>
+            </w:r>
+          </w:p>
+        </w:tc>
+        <w:tc>
+          <w:tcPr>
+            <w:tcW w:w="2948" w:type="dxa"/>
+          </w:tcPr>
+          <w:p>
+            <w:pPr>
+              <w:ind w:firstLine="0"/>
+              <w:rPr>
+                <w:szCs w:val="26"/>
+              </w:rPr>
+            </w:pPr>
+            <w:r>
+              <w:rPr>
+                <w:szCs w:val="26"/>
+              </w:rPr>
+              <w:t>Sau khi trừ chi phí, Hiệu trưởng quyết định tỷ lệ theo tham mưu của Phòng Khoa học Công nghệ, Bộ phận Pháp chế và Phòng Tài chính - Kế toán</w:t>
+            </w:r>
+          </w:p>
+        </w:tc>
+        <w:tc>
+          <w:tcPr>
+            <w:tcW w:w="1361" w:type="dxa"/>
+          </w:tcPr>
+          <w:p>
+            <w:pPr>
+              <w:ind w:firstLine="0"/>
+              <w:jc w:val="center"/>
+              <w:rPr>
+                <w:szCs w:val="26"/>
+              </w:rPr>
+            </w:pPr>
+            <w:r>
+              <w:rPr>
+                <w:szCs w:val="26"/>
+              </w:rPr>
+              <w:t>Không quy định</w:t>
+            </w:r>
+          </w:p>
+        </w:tc>
+      </w:tr>
+      <w:tr>
+        <w:trPr>
+          <w:jc w:val="center"/>
+        </w:trPr>
+        <w:tc>
+          <w:tcPr>
+            <w:tcW w:w="2608" w:type="dxa"/>
+          </w:tcPr>
+          <w:p>
+            <w:pPr>
+              <w:ind w:firstLine="0"/>
+              <w:rPr>
+                <w:szCs w:val="26"/>
+              </w:rPr>
+            </w:pPr>
+            <w:r>
+              <w:rPr>
+                <w:szCs w:val="26"/>
+              </w:rPr>
               <w:t>Quy chế chi tiêu nội bộ</w:t>
             </w:r>
           </w:p>
@@ -5943,7 +6052,7 @@
           <w:i/>
           <w:szCs w:val="26"/>
         </w:rPr>
-        <w:t>Nguồn: Tổng hợp của nhóm nghiên cứu từ ba văn bản nội bộ của Trường Đại học Thành Đô.</w:t>
+        <w:t>Nguồn: Tổng hợp của nhóm nghiên cứu từ bốn văn bản nội bộ của Trường Đại học Thành Đô.</w:t>
       </w:r>
     </w:p>
     <w:p>
@@ -5956,7 +6065,7 @@
         <w:rPr>
           <w:szCs w:val="26"/>
         </w:rPr>
-        <w:t>Bốn quy định này chưa được rà soát để bảo đảm tính thống nhất. Một giảng viên có sản phẩm đủ điều kiện bảo hộ không thể xác định phần lợi ích của mình theo quy định nào: 30% có trần 100 triệu đồng theo điểm a hay 30% không đặt trần theo điểm b của cùng khoản 4 Điều 36 Quyết định 213, phần còn lại sau khi trích 50% về Trường theo Quy chế chi tiêu nội bộ vốn không nêu rõ phần của tác giả, hay 50% giảm dần xuống 20% theo Điều lệ Quỹ. Sự thiếu rõ ràng này được xác định từ chính văn bản, không cần đến dữ liệu khảo sát, và là một trong những nguyên nhân được phân tích tại Mục 2.5.</w:t>
+        <w:t>Năm quy định này chưa được rà soát để bảo đảm tính thống nhất. Một giảng viên có sản phẩm đủ điều kiện bảo hộ không thể xác định phần lợi ích của mình theo quy định nào: 30% có trần 100 triệu đồng theo điểm a hay 30% không đặt trần theo điểm b của cùng khoản 4 Điều 36 Quyết định 213, một tỷ lệ do Hiệu trưởng quyết định theo Điều 13 Quy chế quản trị tài sản trí tuệ năm 2024, phần còn lại sau khi trích 50% về Trường theo Quy chế chi tiêu nội bộ vốn không nêu rõ phần của tác giả, hay 50% giảm dần xuống 20% theo Điều lệ Quỹ. Sự thiếu rõ ràng này được xác định từ chính văn bản, không cần đến dữ liệu khảo sát, và là một trong những nguyên nhân được phân tích tại Mục 2.5.</w:t>
       </w:r>
     </w:p>
     <w:p>
@@ -6045,7 +6154,7 @@
         <w:rPr>
           <w:szCs w:val="26"/>
         </w:rPr>
-        <w:t>Với khoản thu dưới khoảng 667 triệu đồng, cả bốn đường của quy chế nội bộ đều nằm trên đường mặc định 15% của Luật, cho thấy về mặt tỷ lệ, Nhà trường không kém hào phóng so với chuẩn pháp luật; vượt ngưỡng này, đường điểm a nằm dưới đường của Luật do tác động của mức trần, như thể hiện tại mức thu 700 triệu đồng. Vấn đề nằm ở chỗ tác giả không biết trước mình thuộc đường nào. Khi phần thưởng kỳ vọng không xác định được, quyết định đầu tư công sức cho việc đăng ký và chuyển giao cũng khó được đưa ra, đặc biệt khi so với công bố khoa học, nơi mức thưởng được niêm yết rõ theo từng hạng tạp chí.</w:t>
+        <w:t>Quy định thứ năm, tại Điều 13 Quy chế quản trị tài sản trí tuệ năm 2024, không nêu tỷ lệ mà giao Hiệu trưởng quyết định nên không thể mô phỏng. Với khoản thu dưới khoảng 667 triệu đồng, cả bốn đường của quy chế nội bộ đều nằm trên đường mặc định 15% của Luật, cho thấy về mặt tỷ lệ, Nhà trường không kém hào phóng so với chuẩn pháp luật; vượt ngưỡng này, đường điểm a nằm dưới đường của Luật do tác động của mức trần, như thể hiện tại mức thu 700 triệu đồng. Vấn đề nằm ở chỗ tác giả không biết trước mình thuộc đường nào. Khi phần thưởng kỳ vọng không xác định được, quyết định đầu tư công sức cho việc đăng ký và chuyển giao cũng khó được đưa ra, đặc biệt khi so với công bố khoa học, nơi mức thưởng được niêm yết rõ theo từng hạng tạp chí.</w:t>
       </w:r>
     </w:p>
     <w:p>
@@ -6181,7 +6290,7 @@
         <w:rPr>
           <w:szCs w:val="26"/>
         </w:rPr>
-        <w:t>Như vậy, vấn đề của Nhà trường không phải là thiếu đầu mối mà là chức năng bị chia nhỏ. Không đơn vị nào trong bốn đơn vị nêu trên bao quát trọn vẹn chu trình từ nhận diện kết quả nghiên cứu, đánh giá khả năng bảo hộ, xác lập quyền đến khai thác và duy trì hiệu lực. Mỗi đơn vị nắm một đoạn, và giữa các đoạn không có cơ chế chuyển giao hồ sơ. Đây là đặc điểm tổ chức được trở lại tại Mục 2.5.3.</w:t>
+        <w:t>Như vậy, vấn đề của Nhà trường không phải là thiếu đầu mối hay thiếu phân công. Điều 11 Quy chế quản trị tài sản trí tuệ năm 2024 đã giao Phòng Khoa học Công nghệ nhiệm vụ nhận diện, ghi nhận tài sản trí tuệ, xây dựng quy trình và biểu mẫu khai báo, lập hồ sơ theo dõi và xúc tiến thương mại hóa, đồng thời giao Bộ phận Pháp chế thực hiện thủ tục xác lập quyền. Khoảng cách nằm ở khâu thực thi: bộ hồ sơ thu thập được không có biểu mẫu khai báo hay hồ sơ theo dõi tài sản trí tuệ do Phòng lập, và trên thực tế không đơn vị nào trong bốn đơn vị nêu trên bao quát trọn vẹn chu trình từ nhận diện kết quả nghiên cứu, đánh giá khả năng bảo hộ, xác lập quyền đến khai thác và duy trì hiệu lực. Mỗi đơn vị nắm một đoạn, và giữa các đoạn không có cơ chế chuyển giao hồ sơ. Đây là đặc điểm tổ chức được trở lại tại Mục 2.5.3.</w:t>
       </w:r>
     </w:p>
     <w:p>
@@ -6813,7 +6922,7 @@
         <w:rPr>
           <w:szCs w:val="26"/>
         </w:rPr>
-        <w:t>Ngược lại, kênh sinh ra nhiều sản phẩm có khả năng bảo hộ nhất là đề tài cấp cơ sở, với mười một sản phẩm trong năm năm, lại là kênh duy nhất không có dòng chi nào cho phí nộp đơn và duy trì hiệu lực. Tổng kinh phí Nhà trường cấp cho kênh này trong năm năm là 424,75 triệu đồng, mức cao nhất cho một đề tài là 80 triệu đồng, trong khi 19 trên 38 đề tài không được Nhà trường cấp kinh phí bằng tiền, gồm 16 đề tài chỉ được quy đổi giờ nghiên cứu khoa học và 3 đề tài tự tìm nguồn tài trợ. Giữa hai kênh không có cơ chế chuyển tiếp: một sản phẩm hình thành từ đề tài cấp cơ sở, khi cần kinh phí đăng ký, không có đường nào để đề nghị hỗ trợ từ Quỹ.</w:t>
+        <w:t>Ngược lại, kênh sinh ra nhiều sản phẩm có khả năng bảo hộ nhất là đề tài cấp cơ sở, với mười một sản phẩm trong năm năm, lại là kênh duy nhất không có dòng chi nào cho phí nộp đơn và duy trì hiệu lực. Điều 35 Quyết định 213 giao Phòng Khoa học Công nghệ nộp đơn và lệ phí, nhưng Điều 38 về các khoản chi không có mục riêng cho lệ phí đăng ký và phí duy trì hiệu lực; Điều 13 Quy chế quản trị tài sản trí tuệ năm 2024 chỉ đề cập lệ phí xác lập quyền như một khoản được trừ khi phân chia lợi ích, tức sau khi đã có doanh thu. Tổng kinh phí Nhà trường cấp cho kênh này trong năm năm là 424,75 triệu đồng, mức cao nhất cho một đề tài là 80 triệu đồng, trong khi 19 trên 38 đề tài không được Nhà trường cấp kinh phí bằng tiền, gồm 16 đề tài chỉ được quy đổi giờ nghiên cứu khoa học và 3 đề tài tự tìm nguồn tài trợ. Giữa hai kênh không có cơ chế chuyển tiếp: một sản phẩm hình thành từ đề tài cấp cơ sở, khi cần kinh phí đăng ký, không có đường nào để đề nghị hỗ trợ từ Quỹ.</w:t>
       </w:r>
     </w:p>
     <w:p>
@@ -7030,7 +7139,7 @@
         <w:rPr>
           <w:szCs w:val="26"/>
         </w:rPr>
-        <w:t>Tổng hợp lại, thực trạng thể chế, tổ chức và nguồn lực của Nhà trường có ba đặc điểm. Nhà trường không thiếu quy định, mà có ba văn bản quy định chồng lấn và chưa thống nhất về cùng một vấn đề. Nhà trường không thiếu nguồn lực tài chính, với tổng cộng khoảng mười tỷ đồng trong ba kênh, nhưng nguồn lực có gắn cơ chế sở hữu trí tuệ lại không tiếp cận được kênh sinh ra sản phẩm. Và Nhà trường không thiếu đầu mối, mà có hai đầu mối vận hành độc lập cho hai luồng tài sản khác nhau, cộng với một đơn vị có tư cách tổ chức khoa học công nghệ nhưng chưa được giao chức năng quản lý tài sản trí tuệ.</w:t>
+        <w:t>Tổng hợp lại, thực trạng thể chế, tổ chức và nguồn lực của Nhà trường có ba đặc điểm. Nhà trường không thiếu quy định, mà có bốn văn bản quy định chồng lấn và chưa thống nhất về cùng một vấn đề. Nhà trường không thiếu nguồn lực tài chính, với tổng cộng khoảng mười tỷ đồng trong ba kênh, nhưng nguồn lực có gắn cơ chế sở hữu trí tuệ lại không tiếp cận được kênh sinh ra sản phẩm. Và Nhà trường không thiếu đầu mối, mà có hai đầu mối vận hành độc lập cho hai luồng tài sản khác nhau, cộng với một đơn vị có tư cách tổ chức khoa học công nghệ nhưng chưa được giao chức năng quản lý tài sản trí tuệ.</w:t>
       </w:r>
     </w:p>
     <w:p>
@@ -7079,7 +7188,7 @@
         <w:rPr>
           <w:szCs w:val="26"/>
         </w:rPr>
-        <w:t>Để xác định phạm vi tài sản mà Nhà trường đang tạo ra và phạm vi quyền mà Nhà trường thực sự xác lập, nhóm nghiên cứu tiến hành đối sánh ba lớp: các đối tượng quyền theo Luật Sở hữu trí tuệ, các loại tài sản được liệt kê tại Điều 34 Quyết định số 213/QĐ-ĐHTĐ, và thực tế phát sinh trong giai đoạn 2021 - 2025. Kết quả trình bày tại Bảng 2.6.</w:t>
+        <w:t>Để xác định phạm vi tài sản mà Nhà trường đang tạo ra và phạm vi quyền mà Nhà trường thực sự xác lập, nhóm nghiên cứu tiến hành đối sánh ba lớp: các đối tượng quyền theo Luật Sở hữu trí tuệ, các loại tài sản được liệt kê tại Điều 34 Quyết định 213 và Điều 3 Quy chế quản trị tài sản trí tuệ năm 2024, và thực tế phát sinh trong giai đoạn 2021 - 2025. Kết quả trình bày tại Bảng 2.6.</w:t>
       </w:r>
     </w:p>
     <w:p>
@@ -7176,7 +7285,7 @@
                 <w:b/>
                 <w:szCs w:val="26"/>
               </w:rPr>
-              <w:t>Quyết định 213 có liệt kê</w:t>
+              <w:t>Quyết định 213 hoặc Quy chế 2024 có liệt kê</w:t>
             </w:r>
           </w:p>
         </w:tc>
@@ -7694,7 +7803,7 @@
               <w:rPr>
                 <w:szCs w:val="26"/>
               </w:rPr>
-              <w:t>Không nêu riêng</w:t>
+              <w:t>Có, tại Quy chế 2024</w:t>
             </w:r>
           </w:p>
         </w:tc>
@@ -8110,7 +8219,7 @@
               <w:rPr>
                 <w:szCs w:val="26"/>
               </w:rPr>
-              <w:t>Không nêu riêng</w:t>
+              <w:t>Có</w:t>
             </w:r>
           </w:p>
         </w:tc>
@@ -8421,7 +8530,7 @@
               <w:rPr>
                 <w:szCs w:val="26"/>
               </w:rPr>
-              <w:t>Không nêu</w:t>
+              <w:t>Có, tại Quy chế 2024</w:t>
             </w:r>
           </w:p>
         </w:tc>
@@ -8479,7 +8588,7 @@
           <w:i/>
           <w:szCs w:val="26"/>
         </w:rPr>
-        <w:t>Nguồn: Tổng hợp của nhóm nghiên cứu từ Luật Sở hữu trí tuệ, Quyết định số 213/QĐ-ĐHTĐ và các danh mục của Trường Đại học Thành Đô. Bảng không liệt kê thiết kế bố trí mạch tích hợp, chỉ dẫn địa lý và giống cây trồng vì không thuộc phạm vi hoạt động của Nhà trường.</w:t>
+        <w:t>Nguồn: Tổng hợp của nhóm nghiên cứu từ Luật Sở hữu trí tuệ, Quyết định số 213/QĐ-ĐHTĐ, Quy chế quản trị tài sản trí tuệ năm 2024 và các danh mục của Trường Đại học Thành Đô. Bảng không liệt kê thiết kế bố trí mạch tích hợp, chỉ dẫn địa lý và giống cây trồng vì không thuộc phạm vi hoạt động của Nhà trường.</w:t>
       </w:r>
     </w:p>
     <w:p>
@@ -8492,7 +8601,7 @@
         <w:rPr>
           <w:szCs w:val="26"/>
         </w:rPr>
-        <w:t>Bảng 2.6 cho thấy ba điểm. Thứ nhất, Nhà trường phát sinh tài sản ở chín nhóm đối tượng quyền nhưng mới có hoạt động xác lập quyền ở bốn nhóm, trong đó chỉ ba nhóm đã được cấp văn bằng. Thứ hai, Điều 34 Quyết định 213 không liệt kê giải pháp hữu ích và sưu tập dữ liệu, trong khi đây lại là hai nhóm mà sản phẩm đề tài cấp cơ sở rơi vào nhiều nhất. Thứ ba, nhóm tài sản có số lượng lớn nhất là bài báo và giáo trình thì chưa có hoạt động xác lập quyền nào được ghi nhận.</w:t>
+        <w:t>Bảng 2.6 cho thấy ba điểm. Thứ nhất, Nhà trường phát sinh tài sản ở chín nhóm đối tượng quyền nhưng mới có hoạt động xác lập quyền ở bốn nhóm, trong đó chỉ ba nhóm đã được cấp văn bằng. Thứ hai, giải pháp hữu ích và sưu tập dữ liệu, hai nhóm mà sản phẩm đề tài cấp cơ sở rơi vào nhiều nhất, đều đã có trong phạm vi tài sản của quy chế nội bộ: giải pháp hữu ích được liệt kê tại Điều 34 Quyết định 213, sưu tập dữ liệu được bổ sung dưới dạng cơ sở dữ liệu tại Điều 3 Quy chế quản trị tài sản trí tuệ năm 2024. Khoảng trống vì vậy không nằm ở phạm vi văn bản mà ở khâu nhận diện: chưa sản phẩm nào thuộc hai nhóm này được xác lập quyền. Thứ ba, nhóm tài sản có số lượng lớn nhất là bài báo và giáo trình thì chưa có hoạt động xác lập quyền nào được ghi nhận.</w:t>
       </w:r>
     </w:p>
     <w:p>
@@ -12323,7 +12432,7 @@
         <w:rPr>
           <w:szCs w:val="26"/>
         </w:rPr>
-        <w:t>Hình 2.14 cho thấy 9 trên 11 sản phẩm thuộc nhóm sở hữu công nghiệp, trong đó giải pháp hữu ích là hình thức phù hợp với 8 sản phẩm. Đây là kết quả có ý nghĩa đối với thiết kế quy chế: giải pháp hữu ích không đòi hỏi trình độ sáng tạo cao như sáng chế, thời gian bảo hộ ngắn hơn và phù hợp với quy mô kinh phí của đề tài cấp cơ sở, nhưng lại không được nêu riêng tại Điều 34 Quyết định 213. Về nguồn gốc, 10 trên 11 sản phẩm liên quan đến lĩnh vực dược, cho thấy tiềm năng sở hữu công nghiệp của Nhà trường tập trung ở một lĩnh vực và có thể được quản lý có trọng tâm.</w:t>
+        <w:t>Hình 2.14 cho thấy 9 trên 11 sản phẩm thuộc nhóm sở hữu công nghiệp, trong đó giải pháp hữu ích là hình thức phù hợp với 8 sản phẩm. Giải pháp hữu ích không đòi hỏi trình độ sáng tạo như sáng chế, thời gian bảo hộ ngắn hơn và phù hợp với quy mô kinh phí của đề tài cấp cơ sở. Loại hình này đã được liệt kê tại Điều 34 Quyết định 213 và Điều 3 Quy chế quản trị tài sản trí tuệ năm 2024, song chưa sản phẩm nào được nhận diện và nộp đơn theo hình thức này. Về nguồn gốc, 10 trên 11 sản phẩm liên quan đến lĩnh vực dược, cho thấy tiềm năng sở hữu công nghiệp của Nhà trường tập trung ở một lĩnh vực và có thể được quản lý có trọng tâm.</w:t>
       </w:r>
     </w:p>
     <w:p>
@@ -13572,6 +13681,122 @@
     </w:p>
     <w:p>
       <w:pPr>
+        <w:keepNext w:val="0"/>
+        <w:rPr>
+          <w:szCs w:val="26"/>
+        </w:rPr>
+      </w:pPr>
+      <w:r>
+        <w:rPr>
+          <w:szCs w:val="26"/>
+        </w:rPr>
+        <w:t>Trước khi đi vào từng nhóm kết quả và hạn chế, đề tài đối chiếu kết quả thực hiện với Kế hoạch hoạt động khoa học công nghệ giai đoạn 2024 - 2028, tầm nhìn 2035, ban hành kèm Kế hoạch số 07/KH-ĐHTĐ ngày 01 tháng 7 năm 2024. Đây là thước đo khách quan vì do chính Nhà trường đặt ra, và 2024 - 2025 là hai năm đầu của kế hoạch.</w:t>
+      </w:r>
+    </w:p>
+    <w:p>
+      <w:pPr>
+        <w:keepNext/>
+        <w:spacing w:before="160" w:after="80"/>
+        <w:ind w:firstLine="0"/>
+        <w:jc w:val="center"/>
+        <w:rPr>
+          <w:szCs w:val="26"/>
+        </w:rPr>
+      </w:pPr>
+      <w:r>
+        <w:rPr>
+          <w:b/>
+          <w:szCs w:val="26"/>
+        </w:rPr>
+        <w:t>Hình 2.16. Tỷ lệ thực hiện so với chỉ tiêu Kế hoạch 07/KH-ĐHTĐ, cộng dồn hai năm 2024 - 2025</w:t>
+      </w:r>
+    </w:p>
+    <w:p>
+      <w:pPr>
+        <w:keepNext/>
+        <w:spacing w:before="0" w:after="0" w:line="240" w:lineRule="auto"/>
+        <w:ind w:firstLine="0"/>
+        <w:jc w:val="center"/>
+        <w:rPr>
+          <w:szCs w:val="26"/>
+        </w:rPr>
+      </w:pPr>
+      <w:r xmlns:a="http://schemas.openxmlformats.org/drawingml/2006/main" xmlns:c="http://schemas.openxmlformats.org/drawingml/2006/chart">
+        <w:rPr>
+          <w:noProof/>
+        </w:rPr>
+        <w:drawing>
+          <wp:inline distT="0" distB="0" distL="0" distR="0">
+            <wp:extent cx="5580000" cy="4320000"/>
+            <wp:effectExtent l="0" t="0" r="0" b="0"/>
+            <wp:docPr id="516" name="Biểu đồ 516" descr="Hình 2.16. Tỷ lệ thực hiện so với chỉ tiêu Kế hoạch 07/KH-ĐHTĐ, cộng dồn hai năm 2024 - 2025"/>
+            <wp:cNvGraphicFramePr/>
+            <a:graphic>
+              <a:graphicData uri="http://schemas.openxmlformats.org/drawingml/2006/chart">
+                <c:chart r:id="rId24"/>
+              </a:graphicData>
+            </a:graphic>
+          </wp:inline>
+        </w:drawing>
+      </w:r>
+    </w:p>
+    <w:p>
+      <w:pPr>
+        <w:spacing w:after="160"/>
+        <w:ind w:firstLine="0"/>
+        <w:rPr>
+          <w:szCs w:val="26"/>
+        </w:rPr>
+      </w:pPr>
+      <w:r>
+        <w:rPr>
+          <w:i/>
+          <w:szCs w:val="26"/>
+        </w:rPr>
+        <w:t>Nguồn: Nhóm nghiên cứu tính toán từ mục 2.2.4 Kế hoạch số 07/KH-ĐHTĐ ngày 01 tháng 7 năm 2024 và các danh mục thống kê của Phòng Khoa học Công nghệ. Chỉ tiêu bài báo trong nước gồm bài đăng tạp chí trong nước và tạp chí của Trường; tài sản trí tuệ tính số văn bằng được cấp; không gồm tham luận hội thảo quốc gia do danh mục không có năm.</w:t>
+      </w:r>
+    </w:p>
+    <w:p>
+      <w:pPr>
+        <w:rPr>
+          <w:szCs w:val="26"/>
+        </w:rPr>
+      </w:pPr>
+      <w:r>
+        <w:rPr>
+          <w:szCs w:val="26"/>
+        </w:rPr>
+        <w:t>Hình 2.16 cho thấy kết quả hai năm đầu của kế hoạch phân hóa rõ theo ba nhóm, được thể hiện bằng ba màu. Nhóm công bố, màu xanh dương, vượt xa chỉ tiêu: bài báo quốc tế đạt 85 bài so với chỉ tiêu 30 bài, tương đương 283%; sách đạt 267%; tham luận cấp trường đạt 223%; bài báo trong nước đạt 165%. Nhóm đề tài và học liệu, màu xanh lục, dao động quanh mức kế hoạch, từ 90% với giáo trình đến 150% với đề tài cấp Bộ, Nhà nước.</w:t>
+      </w:r>
+    </w:p>
+    <w:p>
+      <w:pPr>
+        <w:rPr>
+          <w:szCs w:val="26"/>
+        </w:rPr>
+      </w:pPr>
+      <w:r>
+        <w:rPr>
+          <w:szCs w:val="26"/>
+        </w:rPr>
+        <w:t>Nhóm tài sản trí tuệ, màu cam, cần được đọc thận trọng. Chỉ tiêu công nhận sáng chế, kiểu dáng công nghiệp và quyền tác giả đạt 150% với 6 văn bằng, nhưng đó là 5 kiểu dáng công nghiệp đồng sở hữu với doanh nghiệp và 1 nhãn hiệu Thado Edupark; không văn bằng nào hình thành từ đề tài nghiên cứu. Chỉ tiêu chuyển giao công nghệ năm 2025 không đạt. Nguyên nhân một phần nằm ở cách thiết kế chỉ tiêu: Kế hoạch gộp sáng chế với kiểu dáng công nghiệp và quyền tác giả, nên chỉ tiêu có thể hoàn thành mà không cần kết quả nghiên cứu nào được bảo hộ.</w:t>
+      </w:r>
+    </w:p>
+    <w:p>
+      <w:pPr>
+        <w:rPr>
+          <w:szCs w:val="26"/>
+        </w:rPr>
+      </w:pPr>
+      <w:r>
+        <w:rPr>
+          <w:szCs w:val="26"/>
+        </w:rPr>
+        <w:t>Bản thân Kế hoạch 07/KH-ĐHTĐ đã tự đánh giá giai đoạn 2019 - 2023 là chưa có công trình nghiên cứu khoa học được chuyển giao công nghệ và tài sản trí tuệ còn hạn chế. Sau hai năm thực hiện, trong khi công bố tăng vượt bậc, hai nhận định này về cơ bản vẫn giữ nguyên. Đây là bằng chứng khái quát nhất cho các kết quả và hạn chế được phân tích dưới đây.</w:t>
+      </w:r>
+    </w:p>
+    <w:p>
+      <w:pPr>
         <w:keepNext/>
         <w:spacing w:before="200" w:after="100"/>
         <w:ind w:firstLine="0"/>
@@ -13598,7 +13823,7 @@
         <w:rPr>
           <w:szCs w:val="26"/>
         </w:rPr>
-        <w:t>Thứ nhất, Nhà trường đã hình thành hệ thống quy định nội bộ về sở hữu trí tuệ từ sớm. Quy chế hoạt động khoa học công nghệ năm 2021 dành riêng một chương cho nội dung này, với phạm vi tài sản được xác định tương đối đầy đủ và quy trình đăng ký một cửa có mốc thời gian cụ thể. So với mặt bằng chung của các cơ sở giáo dục đại học tư thục cùng quy mô, việc ban hành quy định từ năm 2021 là sớm.</w:t>
+        <w:t>Thứ nhất, Nhà trường đã hình thành hệ thống quy định nội bộ về sở hữu trí tuệ từ sớm. Quy chế hoạt động khoa học công nghệ năm 2021 dành riêng một chương cho nội dung này, với phạm vi tài sản được xác định tương đối đầy đủ và quy trình đăng ký một cửa có mốc thời gian cụ thể. So với mặt bằng chung của các cơ sở giáo dục đại học tư thục cùng quy mô, việc ban hành quy định từ năm 2021 là sớm. Năm 2024, Nhà trường tiếp tục ban hành Quy chế quản trị tài sản trí tuệ riêng, với phạm vi tài sản rộng, nguyên tắc công bố và bảo mật, cùng sự phân công đầu mối rõ ràng.</w:t>
       </w:r>
     </w:p>
     <w:p>
@@ -13734,7 +13959,7 @@
         <w:rPr>
           <w:szCs w:val="26"/>
         </w:rPr>
-        <w:t>Thứ tư, hệ thống dữ liệu chưa đáp ứng yêu cầu quản lý. Không có danh mục nào trong hệ thống thống kê khoa học công nghệ theo dõi tài sản trí tuệ. Độ phủ khai báo sản phẩm trong hồ sơ nghiệm thu chỉ đạt 26,2%. Dữ liệu chưa chuẩn hóa về tên đơn vị và phân loại sản phẩm. Hệ quả là Nhà trường chưa tính được phần lớn các chỉ số đánh giá hiệu quả quản lý quyền sở hữu trí tuệ, và chưa đủ điều kiện đáp ứng đầy đủ nghĩa vụ công khai theo điểm đ khoản 3 Điều 28 Luật Giáo dục đại học số 125/2025/QH15.</w:t>
+        <w:t>Thứ tư, hệ thống dữ liệu chưa đáp ứng yêu cầu quản lý. Không có danh mục nào trong hệ thống thống kê khoa học công nghệ theo dõi tài sản trí tuệ. Độ phủ khai báo sản phẩm trong hồ sơ nghiệm thu chỉ khoảng 29,9%. Dữ liệu chưa chuẩn hóa về tên đơn vị và phân loại sản phẩm. Hệ quả là Nhà trường chưa tính được phần lớn các chỉ số đánh giá hiệu quả quản lý quyền sở hữu trí tuệ, và chưa đủ điều kiện đáp ứng đầy đủ nghĩa vụ công khai theo điểm đ khoản 3 Điều 28 Luật Giáo dục đại học số 125/2025/QH15.</w:t>
       </w:r>
     </w:p>
     <w:p>
@@ -13760,7 +13985,7 @@
         <w:rPr>
           <w:szCs w:val="26"/>
         </w:rPr>
-        <w:t>Thứ sáu, khâu kiểm tra và giám sát chưa chặt. Ba đề tài ghi rõ trong hồ sơ nghiệm thu là không có bài báo như cam kết nhưng vẫn được nghiệm thu ở mức Tốt hoặc Đạt. Trong 38 đề tài, có 1 đề tài xếp loại Xuất sắc, 19 đề tài xếp loại Tốt, 1 đề tài xếp loại Khá và 17 đề tài xếp loại Đạt, cho thấy kết quả đánh giá tập trung ở mức cao trong khi mức độ hoàn thành sản phẩm cam kết không đồng đều.</w:t>
+        <w:t>Thứ sáu, khâu kiểm tra và giám sát chưa gắn với sản phẩm. Trong 38 đề tài, có 1 đề tài xếp loại Xuất sắc, 19 đề tài xếp loại Tốt, 1 đề tài xếp loại Khá và 17 đề tài xếp loại Đạt. Bảy đề tài chỉ có sản phẩm là báo cáo tổng kết, nhưng 5 trong số đó vẫn được xếp loại Tốt, cho thấy kết quả đánh giá chưa phân biệt rõ mức độ tạo ra sản phẩm có thể ứng dụng hoặc bảo hộ.</w:t>
       </w:r>
     </w:p>
     <w:p>
@@ -13901,7 +14126,7 @@
         <w:rPr>
           <w:szCs w:val="26"/>
         </w:rPr>
-        <w:t>Về thể chế, ba văn bản nội bộ chứa bốn quy định chia lợi ích khác nhau cho cùng một loại tài sản, với các mức trần khác nhau và phạm vi áp dụng không rõ ranh giới. Người có sản phẩm đủ điều kiện bảo hộ không xác định được quy định nào áp dụng cho trường hợp của mình. Bên cạnh đó, Điều 34 Quyết định 213 không liệt kê giải pháp hữu ích và sưu tập dữ liệu, trong khi đây lại là hai nhóm mà sản phẩm đề tài rơi vào nhiều nhất, dẫn đến các sản phẩm này không được nhận diện là đối tượng cần xác lập quyền.</w:t>
+        <w:t>Về thể chế, bốn văn bản nội bộ chứa năm quy định chia lợi ích khác nhau cho cùng một loại tài sản, với các mức trần khác nhau và phạm vi áp dụng không rõ ranh giới. Người có sản phẩm đủ điều kiện bảo hộ không xác định được quy định nào áp dụng cho trường hợp của mình. Bên cạnh đó, Quy chế quản trị tài sản trí tuệ năm 2024 không dẫn chiếu và không thay thế Chương VI Quyết định 213, nên hai văn bản cùng tồn tại với phạm vi tài sản, phân công đầu mối và cơ chế phân chia lợi ích khác nhau.</w:t>
       </w:r>
     </w:p>
     <w:p>
@@ -13914,14 +14139,7 @@
         <w:rPr>
           <w:szCs w:val="26"/>
         </w:rPr>
-        <w:t xml:space="preserve">Về quy trình, Điều 35 Quyết định 213 thiết kế theo cơ chế tác giả chủ động nộp đơn lên đơn vị đầu mối. Quy trình không có khâu rà soát bắt buộc khả năng bảo hộ tại thời điểm nghiệm thu đề tài. Điều này đòi hỏi tác giả phải tự nhận biết sản phẩm của </w:t>
-      </w:r>
-      <w:r>
-        <w:rPr>
-          <w:szCs w:val="26"/>
-        </w:rPr>
-        <w:lastRenderedPageBreak/>
-        <w:t>mình thuộc đối tượng có thể bảo hộ, tự biết thủ tục và tự khởi động quy trình. Khi không có bước rà soát của đơn vị quản lý, quy trình tồn tại trên văn bản nhưng không được kích hoạt.</w:t>
+        <w:t>Về quy trình, Điều 35 Quyết định 213 thiết kế theo cơ chế tác giả chủ động nộp đơn lên đơn vị đầu mối. Quy trình không có khâu rà soát bắt buộc khả năng bảo hộ tại thời điểm nghiệm thu đề tài. Điều này đòi hỏi tác giả phải tự nhận biết sản phẩm của mình thuộc đối tượng có thể bảo hộ, tự biết thủ tục và tự khởi động quy trình. Khi không có bước rà soát của đơn vị quản lý, quy trình tồn tại trên văn bản nhưng không được kích hoạt. Điều 10 Quy chế quản trị tài sản trí tuệ năm 2024 tiếp tục đặt trách nhiệm này lên tác giả khi yêu cầu tác giả tự xác định tài sản có thể bảo hộ và xin ý kiến Phòng Khoa học Công nghệ trước khi bộc lộ công khai.</w:t>
       </w:r>
     </w:p>
     <w:p>
@@ -13960,7 +14178,7 @@
         <w:rPr>
           <w:szCs w:val="26"/>
         </w:rPr>
-        <w:t>Về tổ chức, chức năng quản lý quyền sở hữu trí tuệ bị chia cho bốn đơn vị mà không đơn vị nào bao quát trọn chu trình. Phòng Khoa học Công nghệ giữ khâu tiếp nhận hồ sơ đăng ký, Trung tâm Tuyển sinh và Quản trị thương hiệu thực hiện xác lập quyền đối với nhãn hiệu và logo, bộ phận pháp chế thuộc Trung tâm Dịch vụ và Quản trị hành chính tổng hợp giữ đầu mối mạng lưới hỗ trợ quốc gia, Viện Nghiên cứu giáo dục và Chuyển giao tri thức nắm khâu khai thác quyền. Việc đặt đầu mối mạng lưới tại bộ phận pháp chế là hợp lý xét về khía cạnh pháp lý của hoạt động xác lập quyền. Tuy nhiên, ba đơn vị đầu đều thuộc khối Quản trị và Dịch vụ, trong khi các đơn vị tạo ra kết quả nghiên cứu lại thuộc khối Đào tạo và Nghiên cứu. Sự phân tán này giải thích vì sao một sản phẩm nghiên cứu có khả năng bảo hộ không tự động đi hết chu trình: mỗi đơn vị chỉ chịu trách nhiệm một đoạn, và giữa các đoạn không có cơ chế chuyển giao hồ sơ hay người chịu trách nhiệm chung.</w:t>
+        <w:t>Về tổ chức, Điều 11 Quy chế quản trị tài sản trí tuệ năm 2024 giao Phòng Khoa học Công nghệ vai trò bao quát chu trình, nhưng trên thực tế chức năng quản lý quyền sở hữu trí tuệ bị chia cho bốn đơn vị mà không đơn vị nào thực hiện trọn chu trình. Phòng Khoa học Công nghệ giữ khâu tiếp nhận hồ sơ đăng ký, Trung tâm Tuyển sinh và Quản trị thương hiệu thực hiện xác lập quyền đối với nhãn hiệu và logo, bộ phận pháp chế thuộc Trung tâm Dịch vụ và Quản trị hành chính tổng hợp giữ đầu mối mạng lưới hỗ trợ quốc gia, Viện Nghiên cứu giáo dục và Chuyển giao tri thức nắm khâu khai thác quyền. Việc đặt đầu mối mạng lưới tại bộ phận pháp chế là hợp lý xét về khía cạnh pháp lý của hoạt động xác lập quyền. Tuy nhiên, ba đơn vị đầu đều thuộc khối Quản trị và Dịch vụ, trong khi các đơn vị tạo ra kết quả nghiên cứu lại thuộc khối Đào tạo và Nghiên cứu. Sự phân tán này giải thích vì sao một sản phẩm nghiên cứu có khả năng bảo hộ không tự động đi hết chu trình: mỗi đơn vị chỉ chịu trách nhiệm một đoạn, và giữa các đoạn không có cơ chế chuyển giao hồ sơ hay người chịu trách nhiệm chung.</w:t>
       </w:r>
     </w:p>
     <w:p>
@@ -13973,14 +14191,7 @@
         <w:rPr>
           <w:szCs w:val="26"/>
         </w:rPr>
-        <w:t xml:space="preserve">Về dữ liệu, do không có danh mục theo dõi tài sản trí tuệ trong hệ thống thống kê khoa học công nghệ, đơn vị đầu mối không có công cụ để phát hiện sản phẩm nào cần rà soát khả năng bảo hộ. Độ phủ khai báo sản phẩm trong hồ sơ nghiệm thu chỉ đạt </w:t>
-      </w:r>
-      <w:r>
-        <w:rPr>
-          <w:szCs w:val="26"/>
-        </w:rPr>
-        <w:lastRenderedPageBreak/>
-        <w:t>26,2% càng thu hẹp phạm vi những gì đơn vị quản lý có thể nhìn thấy. Khi bài báo, loại sản phẩm dễ nhận diện nhất, còn không được khai đủ, thì sản phẩm dạng công thức hoặc quy trình càng ít khả năng được ghi nhận.</w:t>
+        <w:t>Về dữ liệu, do không có danh mục theo dõi tài sản trí tuệ trong hệ thống thống kê khoa học công nghệ, đơn vị đầu mối không có công cụ để phát hiện sản phẩm nào cần rà soát khả năng bảo hộ. Độ phủ khai báo sản phẩm trong hồ sơ nghiệm thu chỉ khoảng 29,9% càng thu hẹp phạm vi những gì đơn vị quản lý có thể nhìn thấy. Khi bài báo, loại sản phẩm dễ nhận diện nhất, còn không được khai đủ, thì sản phẩm dạng công thức hoặc quy trình càng ít khả năng được ghi nhận.</w:t>
       </w:r>
     </w:p>
     <w:p>
@@ -29133,6 +29344,415 @@
 </c:chartSpace>
 </file>
 
+<file path=word/charts/chart16.xml><?xml version="1.0" encoding="utf-8"?>
+<c:chartSpace xmlns:c="http://schemas.openxmlformats.org/drawingml/2006/chart" xmlns:a="http://schemas.openxmlformats.org/drawingml/2006/main" xmlns:r="http://schemas.openxmlformats.org/officeDocument/2006/relationships">
+  <c:lang val="vi-VN"/>
+  <c:roundedCorners val="0"/>
+  <c:chart>
+    <c:autoTitleDeleted val="1"/>
+    <c:plotArea>
+      <c:layout/>
+      <c:barChart>
+        <c:barDir val="bar"/>
+        <c:grouping val="clustered"/>
+        <c:ser>
+          <c:idx val="0"/>
+          <c:order val="0"/>
+          <c:tx>
+            <c:strRef>
+              <c:f>'Du_lieu'!$E$1</c:f>
+              <c:strCache>
+                <c:ptCount val="1"/>
+                <c:pt idx="0">
+                  <c:v>Tỷ lệ thực hiện</c:v>
+                </c:pt>
+              </c:strCache>
+            </c:strRef>
+          </c:tx>
+          <c:spPr>
+            <a:solidFill>
+              <a:srgbClr val="2A78D6"/>
+            </a:solidFill>
+            <a:ln w="9525">
+              <a:solidFill>
+                <a:srgbClr val="FFFFFF"/>
+              </a:solidFill>
+            </a:ln>
+          </c:spPr>
+          <c:dPt>
+            <c:idx val="0"/>
+            <c:spPr>
+              <a:solidFill>
+                <a:srgbClr val="2A78D6"/>
+              </a:solidFill>
+              <a:ln w="9525">
+                <a:solidFill>
+                  <a:srgbClr val="FFFFFF"/>
+                </a:solidFill>
+              </a:ln>
+            </c:spPr>
+          </c:dPt>
+          <c:dPt>
+            <c:idx val="1"/>
+            <c:spPr>
+              <a:solidFill>
+                <a:srgbClr val="2A78D6"/>
+              </a:solidFill>
+              <a:ln w="9525">
+                <a:solidFill>
+                  <a:srgbClr val="FFFFFF"/>
+                </a:solidFill>
+              </a:ln>
+            </c:spPr>
+          </c:dPt>
+          <c:dPt>
+            <c:idx val="2"/>
+            <c:spPr>
+              <a:solidFill>
+                <a:srgbClr val="2A78D6"/>
+              </a:solidFill>
+              <a:ln w="9525">
+                <a:solidFill>
+                  <a:srgbClr val="FFFFFF"/>
+                </a:solidFill>
+              </a:ln>
+            </c:spPr>
+          </c:dPt>
+          <c:dPt>
+            <c:idx val="3"/>
+            <c:spPr>
+              <a:solidFill>
+                <a:srgbClr val="2A78D6"/>
+              </a:solidFill>
+              <a:ln w="9525">
+                <a:solidFill>
+                  <a:srgbClr val="FFFFFF"/>
+                </a:solidFill>
+              </a:ln>
+            </c:spPr>
+          </c:dPt>
+          <c:dPt>
+            <c:idx val="4"/>
+            <c:spPr>
+              <a:solidFill>
+                <a:srgbClr val="1BAF7A"/>
+              </a:solidFill>
+              <a:ln w="9525">
+                <a:solidFill>
+                  <a:srgbClr val="FFFFFF"/>
+                </a:solidFill>
+              </a:ln>
+            </c:spPr>
+          </c:dPt>
+          <c:dPt>
+            <c:idx val="5"/>
+            <c:spPr>
+              <a:solidFill>
+                <a:srgbClr val="1BAF7A"/>
+              </a:solidFill>
+              <a:ln w="9525">
+                <a:solidFill>
+                  <a:srgbClr val="FFFFFF"/>
+                </a:solidFill>
+              </a:ln>
+            </c:spPr>
+          </c:dPt>
+          <c:dPt>
+            <c:idx val="6"/>
+            <c:spPr>
+              <a:solidFill>
+                <a:srgbClr val="2A78D6"/>
+              </a:solidFill>
+              <a:ln w="9525">
+                <a:solidFill>
+                  <a:srgbClr val="FFFFFF"/>
+                </a:solidFill>
+              </a:ln>
+            </c:spPr>
+          </c:dPt>
+          <c:dPt>
+            <c:idx val="7"/>
+            <c:spPr>
+              <a:solidFill>
+                <a:srgbClr val="1BAF7A"/>
+              </a:solidFill>
+              <a:ln w="9525">
+                <a:solidFill>
+                  <a:srgbClr val="FFFFFF"/>
+                </a:solidFill>
+              </a:ln>
+            </c:spPr>
+          </c:dPt>
+          <c:dPt>
+            <c:idx val="8"/>
+            <c:spPr>
+              <a:solidFill>
+                <a:srgbClr val="EB6834"/>
+              </a:solidFill>
+              <a:ln w="9525">
+                <a:solidFill>
+                  <a:srgbClr val="FFFFFF"/>
+                </a:solidFill>
+              </a:ln>
+            </c:spPr>
+          </c:dPt>
+          <c:dPt>
+            <c:idx val="9"/>
+            <c:spPr>
+              <a:solidFill>
+                <a:srgbClr val="EB6834"/>
+              </a:solidFill>
+              <a:ln w="9525">
+                <a:solidFill>
+                  <a:srgbClr val="FFFFFF"/>
+                </a:solidFill>
+              </a:ln>
+            </c:spPr>
+          </c:dPt>
+          <c:dLbls>
+            <c:numFmt formatCode="0%" sourceLinked="0"/>
+            <c:txPr>
+              <a:bodyPr/>
+              <a:lstStyle/>
+              <a:p>
+                <a:pPr>
+                  <a:defRPr sz="900" b="0" baseline="0">
+                    <a:solidFill>
+                      <a:srgbClr val="262522"/>
+                    </a:solidFill>
+                    <a:latin typeface="Times New Roman"/>
+                  </a:defRPr>
+                </a:pPr>
+                <a:endParaRPr lang="en-US"/>
+              </a:p>
+            </c:txPr>
+            <c:showLegendKey val="0"/>
+            <c:showVal val="1"/>
+            <c:showCatName val="0"/>
+            <c:showSerName val="0"/>
+            <c:showPercent val="0"/>
+            <c:showBubbleSize val="0"/>
+          </c:dLbls>
+          <c:cat>
+            <c:strRef>
+              <c:f>'Du_lieu'!$A$2:$A$11</c:f>
+              <c:strCache>
+                <c:ptCount val="10"/>
+                <c:pt idx="0">
+                  <c:v>Bài báo tạp chí quốc tế</c:v>
+                </c:pt>
+                <c:pt idx="1">
+                  <c:v>Sách có chỉ số ISBN</c:v>
+                </c:pt>
+                <c:pt idx="2">
+                  <c:v>Tham luận hội thảo cấp trường</c:v>
+                </c:pt>
+                <c:pt idx="3">
+                  <c:v>Bài báo tạp chí trong nước, gồm tạp chí của Trường</c:v>
+                </c:pt>
+                <c:pt idx="4">
+                  <c:v>Đề tài cấp Bộ, Nhà nước</c:v>
+                </c:pt>
+                <c:pt idx="5">
+                  <c:v>Đề tài cấp cơ sở</c:v>
+                </c:pt>
+                <c:pt idx="6">
+                  <c:v>Tham luận hội thảo quốc tế</c:v>
+                </c:pt>
+                <c:pt idx="7">
+                  <c:v>Giáo trình, tài liệu tham khảo</c:v>
+                </c:pt>
+                <c:pt idx="8">
+                  <c:v>Công nhận sáng chế, kiểu dáng, quyền tác giả</c:v>
+                </c:pt>
+                <c:pt idx="9">
+                  <c:v>Chuyển giao công nghệ</c:v>
+                </c:pt>
+              </c:strCache>
+            </c:strRef>
+          </c:cat>
+          <c:val>
+            <c:numRef>
+              <c:f>'Du_lieu'!$E$2:$E$11</c:f>
+              <c:numCache>
+                <c:formatCode>General</c:formatCode>
+                <c:ptCount val="10"/>
+                <c:pt idx="0">
+                  <c:v>2.833333333333333</c:v>
+                </c:pt>
+                <c:pt idx="1">
+                  <c:v>2.666666666666667</c:v>
+                </c:pt>
+                <c:pt idx="2">
+                  <c:v>2.233333333333333</c:v>
+                </c:pt>
+                <c:pt idx="3">
+                  <c:v>1.645454545454546</c:v>
+                </c:pt>
+                <c:pt idx="4">
+                  <c:v>1.5</c:v>
+                </c:pt>
+                <c:pt idx="5">
+                  <c:v>1.071428571428571</c:v>
+                </c:pt>
+                <c:pt idx="6">
+                  <c:v>0.9090909090909091</c:v>
+                </c:pt>
+                <c:pt idx="7">
+                  <c:v>0.9</c:v>
+                </c:pt>
+                <c:pt idx="8">
+                  <c:v>1.5</c:v>
+                </c:pt>
+                <c:pt idx="9">
+                  <c:v>0</c:v>
+                </c:pt>
+              </c:numCache>
+            </c:numRef>
+          </c:val>
+        </c:ser>
+        <c:gapWidth val="45"/>
+        <c:axId val="50010001"/>
+        <c:axId val="50010002"/>
+      </c:barChart>
+      <c:catAx>
+        <c:axId val="50010001"/>
+        <c:scaling>
+          <c:orientation val="maxMin"/>
+        </c:scaling>
+        <c:axPos val="l"/>
+        <c:majorTickMark val="none"/>
+        <c:minorTickMark val="none"/>
+        <c:tickLblPos val="nextTo"/>
+        <c:spPr>
+          <a:ln w="9525">
+            <a:solidFill>
+              <a:srgbClr val="8C8B86"/>
+            </a:solidFill>
+          </a:ln>
+        </c:spPr>
+        <c:txPr>
+          <a:bodyPr/>
+          <a:lstStyle/>
+          <a:p>
+            <a:pPr>
+              <a:defRPr sz="1000" b="0" baseline="0">
+                <a:solidFill>
+                  <a:srgbClr val="262522"/>
+                </a:solidFill>
+                <a:latin typeface="Times New Roman"/>
+              </a:defRPr>
+            </a:pPr>
+            <a:endParaRPr lang="en-US"/>
+          </a:p>
+        </c:txPr>
+        <c:crossAx val="50010002"/>
+        <c:crosses val="autoZero"/>
+        <c:auto val="1"/>
+        <c:lblAlgn val="ctr"/>
+        <c:lblOffset val="100"/>
+      </c:catAx>
+      <c:valAx>
+        <c:axId val="50010002"/>
+        <c:scaling>
+          <c:orientation val="minMax"/>
+          <c:min val="0"/>
+        </c:scaling>
+        <c:axPos val="t"/>
+        <c:majorGridlines>
+          <c:spPr>
+            <a:ln w="6350">
+              <a:solidFill>
+                <a:srgbClr val="DEDDD8"/>
+              </a:solidFill>
+            </a:ln>
+          </c:spPr>
+        </c:majorGridlines>
+        <c:title>
+          <c:tx>
+            <c:rich>
+              <a:bodyPr/>
+              <a:lstStyle/>
+              <a:p>
+                <a:pPr>
+                  <a:defRPr sz="1000" b="1" baseline="0">
+                    <a:solidFill>
+                      <a:srgbClr val="262522"/>
+                    </a:solidFill>
+                    <a:latin typeface="Times New Roman"/>
+                  </a:defRPr>
+                </a:pPr>
+                <a:r>
+                  <a:rPr lang="en-US" sz="1000" b="1" baseline="0">
+                    <a:solidFill>
+                      <a:srgbClr val="262522"/>
+                    </a:solidFill>
+                    <a:latin typeface="Times New Roman"/>
+                  </a:rPr>
+                  <a:t>Tỷ lệ thực hiện so với kế hoạch</a:t>
+                </a:r>
+              </a:p>
+            </c:rich>
+          </c:tx>
+          <c:layout/>
+        </c:title>
+        <c:numFmt formatCode="0%" sourceLinked="0"/>
+        <c:majorTickMark val="none"/>
+        <c:minorTickMark val="none"/>
+        <c:tickLblPos val="nextTo"/>
+        <c:spPr>
+          <a:ln w="9525">
+            <a:solidFill>
+              <a:srgbClr val="8C8B86"/>
+            </a:solidFill>
+          </a:ln>
+        </c:spPr>
+        <c:txPr>
+          <a:bodyPr/>
+          <a:lstStyle/>
+          <a:p>
+            <a:pPr>
+              <a:defRPr sz="1000" b="0" baseline="0">
+                <a:solidFill>
+                  <a:srgbClr val="262522"/>
+                </a:solidFill>
+                <a:latin typeface="Times New Roman"/>
+              </a:defRPr>
+            </a:pPr>
+            <a:endParaRPr lang="en-US"/>
+          </a:p>
+        </c:txPr>
+        <c:crossAx val="50010001"/>
+        <c:crosses val="max"/>
+        <c:crossBetween val="between"/>
+      </c:valAx>
+      <c:spPr>
+        <a:ln>
+          <a:noFill/>
+        </a:ln>
+      </c:spPr>
+    </c:plotArea>
+    <c:plotVisOnly val="1"/>
+  </c:chart>
+  <c:spPr>
+    <a:solidFill>
+      <a:srgbClr val="FFFFFF"/>
+    </a:solidFill>
+    <a:ln>
+      <a:noFill/>
+    </a:ln>
+  </c:spPr>
+  <c:externalData r:id="rId1">
+    <c:autoUpdate val="0"/>
+  </c:externalData>
+  <c:printSettings>
+    <c:headerFooter/>
+    <c:pageMargins b="0.75" l="0.7" r="0.7" t="0.75" header="0.3" footer="0.3"/>
+    <c:pageSetup/>
+  </c:printSettings>
+</c:chartSpace>
+</file>
+
 <file path=word/charts/chart2.xml><?xml version="1.0" encoding="utf-8"?>
 <c:chartSpace xmlns:c="http://schemas.openxmlformats.org/drawingml/2006/chart" xmlns:a="http://schemas.openxmlformats.org/drawingml/2006/main" xmlns:r="http://schemas.openxmlformats.org/officeDocument/2006/relationships">
   <c:lang val="vi-VN"/>

</xml_diff>